<commit_message>
Add the Session 02 content-development document; retake console screenshots
The Session 02 document follows the L&D template and Session 01's layout:
the tool boundary, exact approval and the effect ledger, MCP, and the new
platform console, with agenda, activities, knowledge check, assignment and
SME notes. Its Markdown twin is generated with content_md.py.

The console screenshots in guides 08-12 were retaken from the rebuilt
checkpoints, so they show the Tools view and the updated platform map;
each shows the state its caption describes.

Co-Authored-By: Claude Opus 5.5 <noreply@anthropic.com>
Claude-Session: https://claude.ai/code/session_0123W63ZaDAAnYHCFqarTnbL
</commit_message>
<xml_diff>
--- a/L3 2026 Agentic Platform Instructor Materials/instructor-guides/10 Agent identity delegated credentials and containment.docx
+++ b/L3 2026 Agentic Platform Instructor Materials/instructor-guides/10 Agent identity delegated credentials and containment.docx
@@ -2080,7 +2080,7 @@
       <w:r>
         <w:drawing>
           <wp:inline xmlns:a="http://schemas.openxmlformats.org/drawingml/2006/main" xmlns:pic="http://schemas.openxmlformats.org/drawingml/2006/picture">
-            <wp:extent cx="5943600" cy="3943826"/>
+            <wp:extent cx="5943600" cy="3807619"/>
             <wp:docPr id="1" name="Picture 1"/>
             <wp:cNvGraphicFramePr>
               <a:graphicFrameLocks noChangeAspect="1"/>
@@ -2101,7 +2101,7 @@
                   <pic:spPr>
                     <a:xfrm>
                       <a:off x="0" y="0"/>
-                      <a:ext cx="5943600" cy="3943826"/>
+                      <a:ext cx="5943600" cy="3807619"/>
                     </a:xfrm>
                     <a:prstGeom prst="rect"/>
                   </pic:spPr>

</xml_diff>